<commit_message>
Update speaking script for final slides with named presenters and visual cues
</commit_message>
<xml_diff>
--- a/group-sequin/output/documents/SEQUIN_15_Minute_Three_Speaker_Script.docx
+++ b/group-sequin/output/documents/SEQUIN_15_Minute_Three_Speaker_Script.docx
@@ -7,12 +7,12 @@
         <w:pStyle w:val="Title"/>
       </w:pPr>
       <w:r>
-        <w:t>SEQUIN Presentation Script</w:t>
+        <w:t>SEQUIN Final Presentation Speaking Script</w:t>
       </w:r>
     </w:p>
     <w:p>
       <w:r>
-        <w:t>Fifteen minutes divided between three speakers, with approximately five minutes each. This script follows the new slides 15 to 30 in the combined presentation.</w:t>
+        <w:t>This script matches slides 15 to 30 of SEQUIN_Final_Presentation.pptx and its matching PDF. Chandan presents the first five minutes, Saksham the next five and Tejas the final five.</w:t>
       </w:r>
     </w:p>
     <w:p>
@@ -20,18 +20,15 @@
         <w:rPr>
           <w:b/>
         </w:rPr>
-        <w:t xml:space="preserve">Easiest role  </w:t>
+        <w:t xml:space="preserve">Least technical role  </w:t>
       </w:r>
       <w:r>
-        <w:t>Part Three is the least technical. It covers verification, code locations, demonstrations, conclusions and future work.</w:t>
+        <w:t>Tejas keeps the verification, demonstration, conclusions and future-work section.</w:t>
       </w:r>
     </w:p>
     <w:p>
-      <w:pPr>
-        <w:spacing w:after="200"/>
-      </w:pPr>
       <w:r>
-        <w:t>Speak slowly, point to the figures, and pause briefly between slides. Rehearse once with a timer and adjust pauses to keep each part near five minutes.</w:t>
+        <w:t>Read the main paragraphs aloud. The italic visual cues are stage directions. Pause while pointing to graphs and rehearse once with a timer to keep each part near five minutes.</w:t>
       </w:r>
     </w:p>
     <w:p>
@@ -39,15 +36,12 @@
         <w:pStyle w:val="Heading1"/>
       </w:pPr>
       <w:r>
-        <w:t>Part One Critique and Line Protection</w:t>
+        <w:t>Chandan Critique and Line Protection</w:t>
       </w:r>
     </w:p>
     <w:p>
-      <w:pPr>
-        <w:spacing w:after="180"/>
-      </w:pPr>
       <w:r>
-        <w:t>Speaker 1  |  Slides 15 to 19  |  0:00 to 5:00</w:t>
+        <w:t>Chandan  |  Slides 15 to 19  |  First five minutes</w:t>
       </w:r>
     </w:p>
     <w:p>
@@ -59,23 +53,30 @@
       </w:r>
     </w:p>
     <w:p>
+      <w:pPr>
+        <w:keepNext/>
+      </w:pPr>
       <w:r>
-        <w:t>Now that we have explained SEQUIN and its implementation, we move to the second part of our project.</w:t>
+        <w:rPr>
+          <w:i/>
+          <w:sz w:val="21"/>
+        </w:rPr>
+        <w:t>Visual cue  Point to the three columns from left to right.</w:t>
       </w:r>
     </w:p>
     <w:p>
       <w:r>
-        <w:t>The paper helps us identify dangerous sequences of transmission-line failures. We wanted to investigate how this analysis could support decisions about making the grid more resilient.</w:t>
+        <w:t>Now that we have explained SEQUIN and its implementation, we move to our extension work. SEQUIN identifies damaging sequences of transmission-line failures. We wanted to use that analysis to study choices that could improve grid resilience.</w:t>
       </w:r>
     </w:p>
     <w:p>
       <w:r>
-        <w:t>We identified three practical gaps. First, finding a dangerous attack does not directly tell us which lines we should protect when our budget is limited. Second, failures may arrive at different speeds. The operator may have more time to respond between some failures and very little time between others. Third, maximizing total electricity supplied treats every megawatt equally. In practice, some services may deserve higher priority.</w:t>
+        <w:t>The slide shows three gaps. First, finding a dangerous attack does not directly tell us which lines to protect with a limited budget. Second, failures can arrive at different speeds, leaving different amounts of time for the operator to respond. Third, maximizing total electricity supplied treats every megawatt equally, even when some services deserve higher priority.</w:t>
       </w:r>
     </w:p>
     <w:p>
       <w:r>
-        <w:t>These gaps motivated our three extensions: line protection, variable response windows, and critical-service priorities.</w:t>
+        <w:t>These gaps motivated line protection, variable response windows and critical-service priorities. We implemented and evaluated all three on the group model.</w:t>
       </w:r>
     </w:p>
     <w:p>
@@ -87,23 +88,30 @@
       </w:r>
     </w:p>
     <w:p>
+      <w:pPr>
+        <w:keepNext/>
+      </w:pPr>
       <w:r>
-        <w:t>Our first extension asks a simple question: if we can protect only a few lines, which lines should we choose?</w:t>
+        <w:rPr>
+          <w:i/>
+          <w:sz w:val="21"/>
+        </w:rPr>
+        <w:t>Visual cue  Follow the three steps on the left, then point to the protection budget.</w:t>
       </w:r>
     </w:p>
     <w:p>
       <w:r>
-        <w:t>The important point is that the attack can change after protection. Suppose we protect a line from the original worst attack. Another sequence might then become the most damaging attack. Therefore, replaying only the original attack would give an incomplete assessment.</w:t>
+        <w:t>Our first extension asks which few lines we should protect. The important point is that the attacker can change its plan after protection. Protecting one line from the original worst attack may make another attack the most damaging.</w:t>
       </w:r>
     </w:p>
     <w:p>
       <w:r>
-        <w:t>We evaluate every eligible ordered pair of failures on our selected small networks. Our method builds the protection plan one line at a time. At each step, it chooses the additional protected line that gives the smallest worst loss across the design scenarios.</w:t>
+        <w:t>We therefore build complete tables of ordered two-line failures for our selected small networks. We choose protection one line at a time. At each step, we add the line that gives the smallest worst loss across our design demand scenarios. We then search again over every eligible attack.</w:t>
       </w:r>
     </w:p>
     <w:p>
       <w:r>
-        <w:t>Here, protection means the line cannot fail through the particular failure mechanism we model. We assume equal protection costs.</w:t>
+        <w:t>The budget runs from zero to three protected lines. Protection makes a line ineligible for the modeled failure. We assume equal costs and perfect hardening against that failure mechanism. The greedy selection rule has no general guarantee of finding the globally best plan.</w:t>
       </w:r>
     </w:p>
     <w:p>
@@ -116,12 +124,12 @@
         <w:pStyle w:val="Heading1"/>
       </w:pPr>
       <w:r>
-        <w:t>Part One Critique and Line Protection Continued</w:t>
+        <w:t>Chandan Critique and Line Protection Continued</w:t>
       </w:r>
     </w:p>
     <w:p>
       <w:r>
-        <w:t>Speaker 1  |  Slides 15 to 19  |  0:00 to 5:00</w:t>
+        <w:t>Chandan  |  Slides 15 to 19  |  First five minutes</w:t>
       </w:r>
     </w:p>
     <w:p>
@@ -133,23 +141,35 @@
       </w:r>
     </w:p>
     <w:p>
+      <w:pPr>
+        <w:keepNext/>
+      </w:pPr>
       <w:r>
-        <w:t>We evaluated this extension on cases 14 and 39. For two sequential failures, case 14 has 380 possible ordered pairs, while case 39 has 2,070.</w:t>
+        <w:rPr>
+          <w:i/>
+          <w:sz w:val="21"/>
+        </w:rPr>
+        <w:t>Visual cue  Point to 380 and 2070, then explain the design and test split.</w:t>
       </w:r>
     </w:p>
     <w:p>
       <w:r>
-        <w:t>We separated the demand scenarios used to select protection from those used to evaluate it. This allows us to check whether a plan also helps under unseen demand conditions.</w:t>
+        <w:t>We used cases 14 and 39. They have 380 and 2,070 possible ordered pairs of line failures. Different failure orders can create different physical responses.</w:t>
       </w:r>
     </w:p>
     <w:p>
       <w:r>
-        <w:t>We compared our method with several alternatives, including random protection, protecting high-flow lines, and protection designed using only one demand scenario.</w:t>
+        <w:t>Design seeds zero, one and two select the protection plan. Separate test seeds 100 to 104 evaluate it under unseen demand, with demand variation of plus or minus five percent.</w:t>
       </w:r>
     </w:p>
     <w:p>
       <w:r>
-        <w:t>We also checked small protection budgets through complete enumeration. This helps us distinguish the quality of our protection-selection method from the quality of the attack search.</w:t>
+        <w:t>The comparisons include random protection, high-flow lines, betweenness, a single design scenario and simultaneous-failure design. For budgets up to two lines, we also enumerate protection choices exactly.</w:t>
+      </w:r>
+    </w:p>
+    <w:p>
+      <w:r>
+        <w:t>Finally, fresh exhaustive attack searches check the saved results. These checks distinguish the quality of the protection plan from the quality of the attack search. Test results never select the plan.</w:t>
       </w:r>
     </w:p>
     <w:p>
@@ -157,27 +177,39 @@
         <w:pStyle w:val="Heading2"/>
       </w:pPr>
       <w:r>
-        <w:t>Slide 18 Protection Results</w:t>
+        <w:t>Slide 18 Protection on Unseen Demands</w:t>
+      </w:r>
+    </w:p>
+    <w:p>
+      <w:pPr>
+        <w:keepNext/>
+      </w:pPr>
+      <w:r>
+        <w:rPr>
+          <w:i/>
+          <w:sz w:val="21"/>
+        </w:rPr>
+        <w:t>Visual cue  Use the left graph for case 14 and the right graph for case 39. Lower loss is better.</w:t>
       </w:r>
     </w:p>
     <w:p>
       <w:r>
-        <w:t>On these plots, lower load loss is better.</w:t>
+        <w:t>The horizontal axis is the number of protected lines. The vertical axis is the mean worst loss on held-out demand scenarios. For each scenario, we allow the attacker to choose its worst eligible sequence.</w:t>
       </w:r>
     </w:p>
     <w:p>
       <w:r>
-        <w:t>For case 14, protecting two lines using our scenario-based method reduces mean held-out worst loss from about 95 percent without protection to about 85 percent. At the same budget, initial-flow protection leaves about 93 percent loss. So, on this case, our selected protection plan provides a meaningful improvement.</w:t>
+        <w:t>On the left, case 14 improves from about 95 percent loss without protection to 84.87 percent with two lines protected by our scenario design. Flow protection leaves 93.32 percent loss at the same budget. This is a useful improvement on this case.</w:t>
       </w:r>
     </w:p>
     <w:p>
       <w:r>
-        <w:t>However, the result is mixed on case 39. At a budget of two lines, our method leaves about 20.47 percent loss, while initial-flow protection leaves about 20.35 percent. The simpler baseline performs slightly better.</w:t>
+        <w:t>On the right, the outcome is mixed. At two protected lines, our design leaves 20.47 percent loss, while flow protection leaves 20.35 percent. Flow is slightly better there. Our design improves further at three lines.</w:t>
       </w:r>
     </w:p>
     <w:p>
       <w:r>
-        <w:t>This means our method can find useful plans, but we cannot claim that it always chooses the best plan for unseen conditions.</w:t>
+        <w:t>The method can find useful plans, but these results do not show that it always selects the best protection for unseen conditions.</w:t>
       </w:r>
     </w:p>
     <w:p>
@@ -185,27 +217,34 @@
         <w:pStyle w:val="Heading2"/>
       </w:pPr>
       <w:r>
-        <w:t>Slide 19 Robustness</w:t>
+        <w:t>Slide 19 Protection Under Shifted Conditions</w:t>
+      </w:r>
+    </w:p>
+    <w:p>
+      <w:pPr>
+        <w:keepNext/>
+      </w:pPr>
+      <w:r>
+        <w:rPr>
+          <w:i/>
+          <w:sz w:val="21"/>
+        </w:rPr>
+        <w:t>Visual cue  Point to the positive bars, then the 10 of 36 and 35 point 48 highlights.</w:t>
       </w:r>
     </w:p>
     <w:p>
       <w:r>
-        <w:t>We then changed demand conditions and generator response limits while keeping the protection plans fixed. Our nominal robust plan performed worse than flow protection in 10 of 36 feasible stress comparisons.</w:t>
+        <w:t>Next, we kept the plans fixed and changed demand conditions and generator response limits. On this graph, positive bars mean our scenario design performs worse than flow protection. Negative bars mean it performs better.</w:t>
       </w:r>
     </w:p>
     <w:p>
       <w:r>
-        <w:t>Some stress scenarios were already infeasible before an attack, so we recorded them separately.</w:t>
+        <w:t>It loses to flow in ten of 36 feasible comparisons. The largest excess loss is 35.48 percentage points. Some other scenarios were already infeasible before any attack, so their policy rows are recorded separately.</w:t>
       </w:r>
     </w:p>
     <w:p>
       <w:r>
-        <w:t>The conclusion is that protection helps, but its success depends on the conditions used during design. A useful next step is to design protection across both demand uncertainty and response-speed uncertainty.</w:t>
-      </w:r>
-    </w:p>
-    <w:p>
-      <w:r>
-        <w:t>I will now hand over to the next speaker to explain the timing and critical-service extensions.</w:t>
+        <w:t>Protection therefore depends on the conditions used during design. A useful next step is to design plans across both demand and response-speed uncertainty. Saksham will now explain the timing and critical-service extensions.</w:t>
       </w:r>
     </w:p>
     <w:p>
@@ -218,15 +257,12 @@
         <w:pStyle w:val="Heading1"/>
       </w:pPr>
       <w:r>
-        <w:t>Part Two Timing and Critical Services</w:t>
+        <w:t>Saksham Timing and Critical Services</w:t>
       </w:r>
     </w:p>
     <w:p>
-      <w:pPr>
-        <w:spacing w:after="180"/>
-      </w:pPr>
       <w:r>
-        <w:t>Speaker 2  |  Slides 20 to 24  |  5:00 to 10:00</w:t>
+        <w:t>Saksham  |  Slides 20 to 24  |  Next five minutes</w:t>
       </w:r>
     </w:p>
     <w:p>
@@ -238,23 +274,30 @@
       </w:r>
     </w:p>
     <w:p>
+      <w:pPr>
+        <w:keepNext/>
+      </w:pPr>
       <w:r>
-        <w:t>Our second extension studies the time available between failures.</w:t>
+        <w:rPr>
+          <w:i/>
+          <w:sz w:val="21"/>
+        </w:rPr>
+        <w:t>Visual cue  Point to the three coloured windows in each horizontal bar.</w:t>
       </w:r>
     </w:p>
     <w:p>
       <w:r>
-        <w:t>The basic idea is that generators cannot change their output instantly. A longer response window allows more adjustment, while a shorter window allows less.</w:t>
+        <w:t>Our second extension studies the time available between failures. Generators cannot change output instantly. A longer window allows more adjustment, while a shorter window allows less.</w:t>
       </w:r>
     </w:p>
     <w:p>
       <w:r>
-        <w:t>We compare three patterns over the same total horizon of 15 minutes. The even pattern uses three five-minute windows. The early-cluster pattern uses one minute, one minute, and thirteen minutes. The late-cluster pattern uses thirteen minutes, one minute, and one minute.</w:t>
+        <w:t>Each bar represents the same total horizon of fifteen minutes. The even pattern uses five, five and five minutes. The early cluster uses one, one and thirteen. The late cluster uses thirteen, one and one.</w:t>
       </w:r>
     </w:p>
     <w:p>
       <w:r>
-        <w:t>We also make the sequential and simultaneous comparisons fairer by giving both three redispatch opportunities. For the simultaneous case, all selected lines fail in the first window, but the operator can still adjust again during the remaining windows.</w:t>
+        <w:t>Both sequential and simultaneous comparisons receive three redispatch decisions. In the sequential case, one new failure occurs in each window. In the simultaneous case, all selected lines fail in the first window, followed by two more responses. This makes the comparison fairer. We also test horizons of seven and a half minutes and thirty minutes.</w:t>
       </w:r>
     </w:p>
     <w:p>
@@ -262,27 +305,34 @@
         <w:pStyle w:val="Heading2"/>
       </w:pPr>
       <w:r>
-        <w:t>Slide 21 Timing Results</w:t>
+        <w:t>Slide 21 Final Loss and the Energy Proxy</w:t>
+      </w:r>
+    </w:p>
+    <w:p>
+      <w:pPr>
+        <w:keepNext/>
+      </w:pPr>
+      <w:r>
+        <w:rPr>
+          <w:i/>
+          <w:sz w:val="21"/>
+        </w:rPr>
+        <w:t>Visual cue  Compare the left and right plots, using the two large number pairs below them.</w:t>
       </w:r>
     </w:p>
     <w:p>
       <w:r>
-        <w:t>This slide shows that final load loss and time-weighted loss answer different questions. The left plot measures how much demand is unserved at the end.</w:t>
+        <w:t>These case-118 plots measure different outcomes. The left shows demand unserved at the end. The right shows a snapshot energy proxy, calculated by weighting each response snapshot's loss by its window duration.</w:t>
       </w:r>
     </w:p>
     <w:p>
       <w:r>
-        <w:t>The right plot measures a snapshot energy proxy. We calculate it by multiplying the loss at each response snapshot by the duration of its window, then adding the contributions.</w:t>
+        <w:t>For the sequential case, moving from even to late windows increases final loss from 26.3 to 35.4 percent. But the snapshot proxy falls from 16.0 to 7.1 percent. A larger final loss can receive less time weight when it appears near the end.</w:t>
       </w:r>
     </w:p>
     <w:p>
       <w:r>
-        <w:t>For case 118, the sequential even pattern gives approximately 26 percent final loss. The late-cluster pattern gives approximately 35 percent final loss, but its energy proxy is much smaller. This happens because the larger loss appears in the short later windows and receives less time weight.</w:t>
-      </w:r>
-    </w:p>
-    <w:p>
-      <w:r>
-        <w:t>Therefore, a smaller energy proxy does not necessarily mean a better final condition. We also clearly label this measure as a proxy. We do not simulate the continuous generator and service trajectories inside each window.</w:t>
+        <w:t>These summaries average per-seed cohort maxima. The worst sequence for one metric may differ from the worst sequence for the other. The proxy also does not integrate continuous generator ramps. A smaller proxy alone therefore does not establish a better final condition.</w:t>
       </w:r>
     </w:p>
     <w:p>
@@ -295,12 +345,12 @@
         <w:pStyle w:val="Heading1"/>
       </w:pPr>
       <w:r>
-        <w:t>Part Two Timing and Critical Services Continued</w:t>
+        <w:t>Saksham Timing and Critical Services Continued</w:t>
       </w:r>
     </w:p>
     <w:p>
       <w:r>
-        <w:t>Speaker 2  |  Slides 20 to 24  |  5:00 to 10:00</w:t>
+        <w:t>Saksham  |  Slides 20 to 24  |  Next five minutes</w:t>
       </w:r>
     </w:p>
     <w:p>
@@ -308,27 +358,34 @@
         <w:pStyle w:val="Heading2"/>
       </w:pPr>
       <w:r>
-        <w:t>Slide 22 Critical Service Objectives</w:t>
+        <w:t>Slide 22 Critical Service Operating Objectives</w:t>
+      </w:r>
+    </w:p>
+    <w:p>
+      <w:pPr>
+        <w:keepNext/>
+      </w:pPr>
+      <w:r>
+        <w:rPr>
+          <w:i/>
+          <w:sz w:val="21"/>
+        </w:rPr>
+        <w:t>Visual cue  Read the four policy cards from left to right.</w:t>
       </w:r>
     </w:p>
     <w:p>
       <w:r>
-        <w:t>Our third extension changes which demand the operator tries hardest to preserve. The original objective maximizes total served electricity. It does not distinguish between different service types.</w:t>
+        <w:t>The third extension changes which demand the operator prioritizes. We use synthetic groups of load buses to represent critical services. These are illustrative assignments, rather than identified hospitals or other real facilities.</w:t>
       </w:r>
     </w:p>
     <w:p>
       <w:r>
-        <w:t>We introduce synthetic priority groups to represent the idea of critical services. These are illustrative groups, not identified hospitals or other real facilities.</w:t>
+        <w:t>The first card is total-tight. Every megawatt counts equally, using the same tight solver precision as the priority policies. Weight two makes a critical megawatt count twice as much as ordinary demand. Weight ten makes it count ten times as much.</w:t>
       </w:r>
     </w:p>
     <w:p>
       <w:r>
-        <w:t>We compare four main objectives. The total-service baseline values every megawatt equally. Weight two gives critical demand twice the importance of ordinary demand. Weight ten gives it ten times the importance. Critical-first first maximizes critical service, then maximizes total service while retaining that critical-service optimum within a small numerical tolerance.</w:t>
-      </w:r>
-    </w:p>
-    <w:p>
-      <w:r>
-        <w:t>Every policy starts from the same initial operating condition and faces the same evaluated attack sequences.</w:t>
+        <w:t>Critical-first maximizes critical service first, then maximizes total service while retaining that first optimum within a small tolerance. Every policy starts from the same initial dispatch and faces the same evaluated attack sequences. This lets us compare operating priorities fairly.</w:t>
       </w:r>
     </w:p>
     <w:p>
@@ -336,27 +393,34 @@
         <w:pStyle w:val="Heading2"/>
       </w:pPr>
       <w:r>
-        <w:t>Slide 23 Critical Service Results</w:t>
+        <w:t>Slide 23 Critical Service at the Nominal Setting</w:t>
+      </w:r>
+    </w:p>
+    <w:p>
+      <w:pPr>
+        <w:keepNext/>
+      </w:pPr>
+      <w:r>
+        <w:rPr>
+          <w:i/>
+          <w:sz w:val="21"/>
+        </w:rPr>
+        <w:t>Visual cue  Higher bars are better. Point to the case-39 and case-118 highlights.</w:t>
       </w:r>
     </w:p>
     <w:p>
       <w:r>
-        <w:t>Here, higher critical-service retention is better.</w:t>
+        <w:t>Here, the vertical axis shows critical demand retained. Higher is better. The setting uses priority groups containing 25 percent of positive-demand buses and a ramp fraction of zero point one.</w:t>
       </w:r>
     </w:p>
     <w:p>
       <w:r>
-        <w:t>At the nominal setting, the total-service baseline retains about 67 percent of critical demand in case 39 and about 77 percent in case 118, using our worst-case summary over the evaluated attacks. The priority policies increase the measured retention to approximately 100 percent in these larger cases.</w:t>
+        <w:t>The total-tight baseline retains about 67 percent in case 39 and about 77 percent in case 118. The priority policies raise the measured retention to approximately 100 percent in those two larger cases. Case 14 improves much less because the network constraints still limit service.</w:t>
       </w:r>
     </w:p>
     <w:p>
       <w:r>
-        <w:t>However, this is a result for the evaluated attack cohort. It is not a guarantee against every possible attack.</w:t>
-      </w:r>
-    </w:p>
-    <w:p>
-      <w:r>
-        <w:t>Case 14 shows a much smaller improvement. This reminds us that changing priorities cannot remove the underlying network constraints.</w:t>
+        <w:t>These are worst-case summaries over the evaluated attack cohort. Case 14 is exhaustive, while the larger cases use a shared sampled cohort. The larger-case results do not guarantee protection against every possible attack.</w:t>
       </w:r>
     </w:p>
     <w:p>
@@ -364,32 +428,34 @@
         <w:pStyle w:val="Heading2"/>
       </w:pPr>
       <w:r>
-        <w:t>Slide 24 Gains and Adverse Cases</w:t>
+        <w:t>Slide 24 Priority Gains and Adverse Cases</w:t>
+      </w:r>
+    </w:p>
+    <w:p>
+      <w:pPr>
+        <w:keepNext/>
+      </w:pPr>
+      <w:r>
+        <w:rPr>
+          <w:i/>
+          <w:sz w:val="21"/>
+        </w:rPr>
+        <w:t>Visual cue  Explain the positive case on the left and the adverse case on the right.</w:t>
       </w:r>
     </w:p>
     <w:p>
       <w:r>
-        <w:t>Priority service also has costs. In one deliberately selected positive example, critical-first preserves about 1,573 megawatts more critical demand than the baseline, while increasing total loss by about 121 megawatts. This means some ordinary demand is sacrificed to preserve critical demand.</w:t>
+        <w:t>Priority service also has costs. The left card shows a selected positive example on case 39. Critical-first preserves about 1,573 megawatts more critical demand than total-tight, at about 121 megawatts of extra total loss.</w:t>
       </w:r>
     </w:p>
     <w:p>
       <w:r>
-        <w:t>We also found an adverse example where critical-first causes about 240 megawatts more critical loss after the later failure.</w:t>
+        <w:t>The right card shows a selected adverse example on case 14. After the later failure, critical-first loses about 240 megawatts more critical service than the baseline. Extra total loss is about 323 megawatts.</w:t>
       </w:r>
     </w:p>
     <w:p>
       <w:r>
-        <w:t>The operator optimizes the current response without knowing the next outage. An early decision can therefore create a worse later state.</w:t>
-      </w:r>
-    </w:p>
-    <w:p>
-      <w:r>
-        <w:t>These examples are selected extremes, not average outcomes. Our conclusion is that priorities are useful, but they require evaluation over complete failure sequences.</w:t>
-      </w:r>
-    </w:p>
-    <w:p>
-      <w:r>
-        <w:t>The final speaker will explain our checks, demonstrations and conclusions.</w:t>
+        <w:t>The operator optimizes its current response without knowing the next outage. A decision that helps now can therefore create a worse later state. These are selected extremes, rather than average outcomes. Tejas will now explain the sensitivity checks, demonstration and conclusions.</w:t>
       </w:r>
     </w:p>
     <w:p>
@@ -402,15 +468,12 @@
         <w:pStyle w:val="Heading1"/>
       </w:pPr>
       <w:r>
-        <w:t>Part Three Verification Demonstration and Conclusions</w:t>
+        <w:t>Tejas Verification and Conclusions</w:t>
       </w:r>
     </w:p>
     <w:p>
-      <w:pPr>
-        <w:spacing w:after="180"/>
-      </w:pPr>
       <w:r>
-        <w:t>Speaker 3  |  Slides 25 to 30  |  10:00 to 15:00  |  Easiest role</w:t>
+        <w:t>Tejas  |  Slides 25 to 30  |  Final five minutes  |  Least technical role</w:t>
       </w:r>
     </w:p>
     <w:p>
@@ -418,27 +481,34 @@
         <w:pStyle w:val="Heading2"/>
       </w:pPr>
       <w:r>
-        <w:t>Slide 25 Sensitivity to Response Speed</w:t>
+        <w:t>Slide 25 Critical Service Across Response Speeds</w:t>
+      </w:r>
+    </w:p>
+    <w:p>
+      <w:pPr>
+        <w:keepNext/>
+      </w:pPr>
+      <w:r>
+        <w:rPr>
+          <w:i/>
+          <w:sz w:val="21"/>
+        </w:rPr>
+        <w:t>Visual cue  Point to the grey baseline and the priority-policy curves in each plot.</w:t>
       </w:r>
     </w:p>
     <w:p>
       <w:r>
-        <w:t>We also checked whether the conclusions change when generators have different response limits.</w:t>
+        <w:t>We also checked what changes when generators can respond at different speeds. The horizontal axis shows the ramp allowance, or how much output a generator may change during a response. The vertical axis shows critical demand retained under the evaluated attacks.</w:t>
       </w:r>
     </w:p>
     <w:p>
       <w:r>
-        <w:t>The horizontal axis represents the ramp allowance: how much a generator can change its output during a response. The vertical axis shows the critical demand retained under the evaluated attacks.</w:t>
+        <w:t>The priority policies generally retain more critical service than the grey total-tight baseline in these larger-case experiments. Some priority curves overlap because their results are almost the same.</w:t>
       </w:r>
     </w:p>
     <w:p>
       <w:r>
-        <w:t>The priority policies generally preserve more critical service than the total-service baseline in these selected larger-grid experiments. However, these curves describe a shared sampled attack cohort. They do not prove that all possible attacks have been covered.</w:t>
-      </w:r>
-    </w:p>
-    <w:p>
-      <w:r>
-        <w:t>We also tested different sizes of synthetic critical groups. Changing the group changes both how many buses receive priority and which buses receive it.</w:t>
+        <w:t>The plots use a shared sampled attack cohort. We also tested priority groups containing ten, 25 and fifty percent of positive-demand buses. These checks show how the conclusions depend on our chosen settings.</w:t>
       </w:r>
     </w:p>
     <w:p>
@@ -446,32 +516,34 @@
         <w:pStyle w:val="Heading2"/>
       </w:pPr>
       <w:r>
-        <w:t>Slide 26 Correctness and Limitations</w:t>
+        <w:t>Slide 26 Correctness and Boundaries of the Results</w:t>
+      </w:r>
+    </w:p>
+    <w:p>
+      <w:pPr>
+        <w:keepNext/>
+      </w:pPr>
+      <w:r>
+        <w:rPr>
+          <w:i/>
+          <w:sz w:val="21"/>
+        </w:rPr>
+        <w:t>Visual cue  Read the three checks across the top, then the orange limitation.</w:t>
       </w:r>
     </w:p>
     <w:p>
       <w:r>
-        <w:t>We used several checks to make the results reviewable. First, all 16 extension tests passed.</w:t>
+        <w:t>We used several checks. All sixteen extension tests passed. On 26 state probes, the extended code matched the untouched group implementation exactly for generation and served demand. Fresh exhaustive protection replays also matched the saved worst-loss results.</w:t>
       </w:r>
     </w:p>
     <w:p>
       <w:r>
-        <w:t>Second, we compared the extended model with the untouched group implementation on 26 state probes. The generation and served-load values matched exactly.</w:t>
+        <w:t>Policies share the same attack sequences within each comparison. Small protection cases use complete attack searches, while larger timing and priority cases use sampled cohorts.</w:t>
       </w:r>
     </w:p>
     <w:p>
       <w:r>
-        <w:t>Third, we independently reran complete post-protection attack searches on selected held-out cases. Their worst losses matched the saved outage-table results. We also checked that each policy faced the same attack sequences within its comparison.</w:t>
-      </w:r>
-    </w:p>
-    <w:p>
-      <w:r>
-        <w:t>There is a separate limitation in the original reproduction benchmark. Its checker fails because a case-162 result at eight failures is missing after an infeasible response. We preserved that limitation rather than treating the run as a complete reproduction.</w:t>
-      </w:r>
-    </w:p>
-    <w:p>
-      <w:r>
-        <w:t>Passing extension checks and reproducing every paper result are separate claims.</w:t>
+        <w:t>There is a separate limitation in our group-code benchmark. A case-162 result at eight failures is missing after an infeasible response. We report that limitation openly. Passing the extension checks does not mean we reproduced every paper result.</w:t>
       </w:r>
     </w:p>
     <w:p>
@@ -479,32 +551,34 @@
         <w:pStyle w:val="Heading2"/>
       </w:pPr>
       <w:r>
-        <w:t>Slide 27 Where to Find the Code</w:t>
+        <w:t>Slide 27 Where the Extensions Are Implemented</w:t>
+      </w:r>
+    </w:p>
+    <w:p>
+      <w:pPr>
+        <w:keepNext/>
+      </w:pPr>
+      <w:r>
+        <w:rPr>
+          <w:i/>
+          <w:sz w:val="21"/>
+        </w:rPr>
+        <w:t>Visual cue  Follow the four blue file names from top to bottom.</w:t>
       </w:r>
     </w:p>
     <w:p>
       <w:r>
-        <w:t>The code is organized around four main files.</w:t>
+        <w:t>The code is organized around four main files. The physical response model is in grid_model.py, including optional service weights and critical-first rules.</w:t>
       </w:r>
     </w:p>
     <w:p>
       <w:r>
-        <w:t>The physical response model is in grid_model.py. This is where the optional service weights and critical-first objective are implemented.</w:t>
+        <w:t>The reusable extension logic is in extensions.py. It contains attack tables, protection selection and timed traces. The experiment settings and result summaries are in run_extensions.py.</w:t>
       </w:r>
     </w:p>
     <w:p>
       <w:r>
-        <w:t>The reusable extension logic is in extensions.py. It contains the protection functions, outage tables and timing calculations.</w:t>
-      </w:r>
-    </w:p>
-    <w:p>
-      <w:r>
-        <w:t>The experiment definitions are in run_extensions.py. This file controls scenario splits, parameter sweeps and result summaries.</w:t>
-      </w:r>
-    </w:p>
-    <w:p>
-      <w:r>
-        <w:t>Finally, audit_extensions.py contains the independent checks and the numerical-precision comparison. All extension responses use the group repository's SciPy defender.</w:t>
+        <w:t>Finally, audit_extensions.py contains fresh replay checks and comparisons using matched numerical precision. The architecture picture on the right connects this work to SEQUIN. All extension experiments use the group repository's existing SciPy defender. The extension README explains where to find the code and results.</w:t>
       </w:r>
     </w:p>
     <w:p>
@@ -517,12 +591,12 @@
         <w:pStyle w:val="Heading1"/>
       </w:pPr>
       <w:r>
-        <w:t>Part Three Verification Demonstration and Conclusions Continued</w:t>
+        <w:t>Tejas Verification and Conclusions Continued</w:t>
       </w:r>
     </w:p>
     <w:p>
       <w:r>
-        <w:t>Speaker 3  |  Slides 25 to 30  |  10:00 to 15:00  |  Easiest role</w:t>
+        <w:t>Tejas  |  Slides 25 to 30  |  Final five minutes  |  Least technical role</w:t>
       </w:r>
     </w:p>
     <w:p>
@@ -530,32 +604,34 @@
         <w:pStyle w:val="Heading2"/>
       </w:pPr>
       <w:r>
-        <w:t>Slide 28 Demonstration</w:t>
+        <w:t>Slide 28 Demonstration and Interpretation</w:t>
+      </w:r>
+    </w:p>
+    <w:p>
+      <w:pPr>
+        <w:keepNext/>
+      </w:pPr>
+      <w:r>
+        <w:rPr>
+          <w:i/>
+          <w:sz w:val="21"/>
+        </w:rPr>
+        <w:t>Visual cue  Use the screenshot. A browser demonstration is optional.</w:t>
       </w:r>
     </w:p>
     <w:p>
       <w:r>
-        <w:t>The offline demonstration provides three ways to inspect the results.</w:t>
+        <w:t>This screenshot shows one recorded protection example. Lines four and three are protected. The replacement worst attack fails line fifteen, followed by line one. The table shows how total loss changes after each failure.</w:t>
       </w:r>
     </w:p>
     <w:p>
       <w:r>
-        <w:t>For protection, we can see which lines are protected and which replacement attack becomes worst afterward.</w:t>
+        <w:t>The saved demonstration also compares timing patterns for the same attack, and shows both a positive and an adverse priority-service example.</w:t>
       </w:r>
     </w:p>
     <w:p>
       <w:r>
-        <w:t>For timing, we can compare the same selected attack under even, early and late response windows.</w:t>
-      </w:r>
-    </w:p>
-    <w:p>
-      <w:r>
-        <w:t>For priority service, we can inspect both a selected positive example and a selected adverse example.</w:t>
-      </w:r>
-    </w:p>
-    <w:p>
-      <w:r>
-        <w:t>The demonstration displays saved traces. It does not run optimization in the browser, which makes it convenient to use during the presentation. The detailed measurements remain available in the CSV and JSON files.</w:t>
+        <w:t>For the interactive view, we can open output slash demonstration dot html and change the selectors. It displays saved traces, so no optimization runs in the browser. The detailed measurements remain in the CSV and JSON files.</w:t>
       </w:r>
     </w:p>
     <w:p>
@@ -563,32 +639,34 @@
         <w:pStyle w:val="Heading2"/>
       </w:pPr>
       <w:r>
-        <w:t>Slide 29 Conclusions</w:t>
+        <w:t>Slide 29 Improvement Mixed Evidence and Failure</w:t>
+      </w:r>
+    </w:p>
+    <w:p>
+      <w:pPr>
+        <w:keepNext/>
+      </w:pPr>
+      <w:r>
+        <w:rPr>
+          <w:i/>
+          <w:sz w:val="21"/>
+        </w:rPr>
+        <w:t>Visual cue  Give one takeaway for each of the three columns.</w:t>
       </w:r>
     </w:p>
     <w:p>
       <w:r>
-        <w:t>Our conclusions are mixed, and that is important.</w:t>
+        <w:t>Our conclusions are mixed. Protection gives useful gains, especially on case 14, but it does not always beat simple baselines under unseen conditions.</w:t>
       </w:r>
     </w:p>
     <w:p>
       <w:r>
-        <w:t>The protection extension finds useful plans, especially on case 14, but does not consistently beat simpler baselines under unseen conditions.</w:t>
+        <w:t>Timing changes both final load loss and the snapshot energy proxy. These measurements should be interpreted separately.</w:t>
       </w:r>
     </w:p>
     <w:p>
       <w:r>
-        <w:t>The timing extension shows that failure spacing changes the final loss and the snapshot energy proxy. These metrics should be interpreted separately.</w:t>
-      </w:r>
-    </w:p>
-    <w:p>
-      <w:r>
-        <w:t>The priority extension can preserve selected critical demand, but may increase other losses or make a decision that harms later critical service.</w:t>
-      </w:r>
-    </w:p>
-    <w:p>
-      <w:r>
-        <w:t>Therefore, our contribution is not a claim that every extension always improves resilience. It is an implemented and evaluated investigation of when these changes help, when they tie, and when they fail.</w:t>
+        <w:t>Critical-service priorities can preserve selected demand, but may increase other losses or harm critical service after a later failure. The work therefore shows when these choices help and where their limitations remain.</w:t>
       </w:r>
     </w:p>
     <w:p>
@@ -596,40 +674,48 @@
         <w:pStyle w:val="Heading2"/>
       </w:pPr>
       <w:r>
-        <w:t>Slide 30 Future Work</w:t>
+        <w:t>Slide 30 Next Steps Motivated by the Results</w:t>
+      </w:r>
+    </w:p>
+    <w:p>
+      <w:pPr>
+        <w:keepNext/>
+      </w:pPr>
+      <w:r>
+        <w:rPr>
+          <w:i/>
+          <w:sz w:val="21"/>
+        </w:rPr>
+        <w:t>Visual cue  Follow the three numbered rows, then move to the original closing slide 31.</w:t>
       </w:r>
     </w:p>
     <w:p>
       <w:r>
-        <w:t>The next steps follow directly from these findings.</w:t>
+        <w:t>Our next steps follow the results. First, design protection across more demand and response-speed conditions, because the stress tests exposed failures.</w:t>
       </w:r>
     </w:p>
     <w:p>
       <w:r>
-        <w:t>Protection should be designed across a wider range of demand and response-speed conditions. Critical-service evaluation should search more strongly for attacks targeting critical demand and test more priority-group assignments.</w:t>
+        <w:t>Second, search more strongly for attacks targeting critical demand and test more priority-group assignments.</w:t>
       </w:r>
     </w:p>
     <w:p>
       <w:r>
-        <w:t>We should also examine how generator restart assumptions and dispatch tie-breaking affect the conclusions.</w:t>
+        <w:t>Third, examine generator restart rules and dispatch ties. A more realistic model could include operator lookahead, continuous ramps, restoration, storage and AC feasibility checks.</w:t>
       </w:r>
     </w:p>
     <w:p>
       <w:r>
-        <w:t>Finally, a more realistic timing model would include continuous ramps, load restoration and storage, followed by validation using more detailed electrical models.</w:t>
-      </w:r>
-    </w:p>
-    <w:p>
-      <w:r>
-        <w:t>This completes our second-part contribution: critique, three implemented extensions, evaluation, demonstrations, conclusions and future work. Thank you.</w:t>
+        <w:t>We have implemented three extensions and measured both their useful gains and their limitations. Thank you.</w:t>
       </w:r>
     </w:p>
     <w:p>
       <w:r>
         <w:rPr>
           <w:i/>
+          <w:sz w:val="21"/>
         </w:rPr>
-        <w:t>Move to the original Thank You slide.</w:t>
+        <w:t>Move to the original closing slide 31. The presentation is complete.</w:t>
       </w:r>
     </w:p>
     <w:sectPr>
@@ -1383,7 +1469,7 @@
       <w:color w:val="000000"/>
       <w:spacing w:val="5"/>
       <w:kern w:val="28"/>
-      <w:sz w:val="42"/>
+      <w:sz w:val="40"/>
       <w:szCs w:val="52"/>
     </w:rPr>
   </w:style>

</xml_diff>